<commit_message>
Higienização do formulário de RCC part3
</commit_message>
<xml_diff>
--- a/backend/scripts/sgq/rcc-pdf/templates/cliente.docx
+++ b/backend/scripts/sgq/rcc-pdf/templates/cliente.docx
@@ -53,16 +53,12 @@
               <w:rPr>
                 <w:rFonts w:ascii="Arial" w:hAnsi="Arial" w:cs="Arial"/>
                 <w:b/>
-                <w:sz w:val="16"/>
-                <w:szCs w:val="16"/>
-              </w:rPr>
-            </w:pPr>
-            <w:r>
-              <w:rPr>
-                <w:rFonts w:ascii="Arial" w:hAnsi="Arial" w:cs="Arial"/>
-                <w:b/>
-                <w:sz w:val="16"/>
-                <w:szCs w:val="16"/>
+              </w:rPr>
+            </w:pPr>
+            <w:r>
+              <w:rPr>
+                <w:rFonts w:ascii="Arial" w:hAnsi="Arial" w:cs="Arial"/>
+                <w:b/>
               </w:rPr>
               <w:t>REGISTRO DE RECLAMAÇÃO DE CLIENTE</w:t>
             </w:r>
@@ -70,8 +66,6 @@
               <w:rPr>
                 <w:rFonts w:ascii="Arial" w:hAnsi="Arial" w:cs="Arial"/>
                 <w:b/>
-                <w:sz w:val="16"/>
-                <w:szCs w:val="16"/>
               </w:rPr>
               <w:t xml:space="preserve"> (RCC)</w:t>
             </w:r>
@@ -92,16 +86,12 @@
               <w:rPr>
                 <w:rFonts w:ascii="Arial" w:hAnsi="Arial" w:cs="Arial"/>
                 <w:b/>
-                <w:sz w:val="16"/>
-                <w:szCs w:val="16"/>
-              </w:rPr>
-            </w:pPr>
-            <w:r>
-              <w:rPr>
-                <w:rFonts w:ascii="Arial" w:hAnsi="Arial" w:cs="Arial"/>
-                <w:b/>
-                <w:sz w:val="16"/>
-                <w:szCs w:val="16"/>
+              </w:rPr>
+            </w:pPr>
+            <w:r>
+              <w:rPr>
+                <w:rFonts w:ascii="Arial" w:hAnsi="Arial" w:cs="Arial"/>
+                <w:b/>
               </w:rPr>
               <w:t>Nº Reclamação:</w:t>
             </w:r>
@@ -118,8 +108,6 @@
               <w:rPr>
                 <w:rFonts w:ascii="Arial" w:hAnsi="Arial" w:cs="Arial"/>
                 <w:b/>
-                <w:sz w:val="16"/>
-                <w:szCs w:val="16"/>
               </w:rPr>
             </w:pPr>
           </w:p>
@@ -135,16 +123,12 @@
               <w:rPr>
                 <w:rFonts w:ascii="Arial" w:hAnsi="Arial" w:cs="Arial"/>
                 <w:b/>
-                <w:sz w:val="16"/>
-                <w:szCs w:val="16"/>
-              </w:rPr>
-            </w:pPr>
-            <w:r>
-              <w:rPr>
-                <w:rFonts w:ascii="Arial" w:hAnsi="Arial" w:cs="Arial"/>
-                <w:b/>
-                <w:sz w:val="16"/>
-                <w:szCs w:val="16"/>
+              </w:rPr>
+            </w:pPr>
+            <w:r>
+              <w:rPr>
+                <w:rFonts w:ascii="Arial" w:hAnsi="Arial" w:cs="Arial"/>
+                <w:b/>
               </w:rPr>
               <w:t>Data do registro:</w:t>
             </w:r>
@@ -161,8 +145,6 @@
               <w:rPr>
                 <w:rFonts w:ascii="Arial" w:hAnsi="Arial" w:cs="Arial"/>
                 <w:b/>
-                <w:sz w:val="16"/>
-                <w:szCs w:val="16"/>
               </w:rPr>
             </w:pPr>
           </w:p>
@@ -178,16 +160,12 @@
               <w:rPr>
                 <w:rFonts w:ascii="Arial" w:hAnsi="Arial" w:cs="Arial"/>
                 <w:b/>
-                <w:sz w:val="16"/>
-                <w:szCs w:val="16"/>
-              </w:rPr>
-            </w:pPr>
-            <w:r>
-              <w:rPr>
-                <w:rFonts w:ascii="Arial" w:hAnsi="Arial" w:cs="Arial"/>
-                <w:b/>
-                <w:sz w:val="16"/>
-                <w:szCs w:val="16"/>
+              </w:rPr>
+            </w:pPr>
+            <w:r>
+              <w:rPr>
+                <w:rFonts w:ascii="Arial" w:hAnsi="Arial" w:cs="Arial"/>
+                <w:b/>
               </w:rPr>
               <w:t>Data de fechamento:</w:t>
             </w:r>
@@ -206,8 +184,6 @@
               <w:rPr>
                 <w:rFonts w:ascii="Arial" w:hAnsi="Arial" w:cs="Arial"/>
                 <w:bCs/>
-                <w:sz w:val="16"/>
-                <w:szCs w:val="16"/>
               </w:rPr>
             </w:pPr>
           </w:p>
@@ -224,16 +200,12 @@
               <w:rPr>
                 <w:rFonts w:ascii="Arial" w:hAnsi="Arial" w:cs="Arial"/>
                 <w:b/>
-                <w:sz w:val="16"/>
-                <w:szCs w:val="16"/>
-              </w:rPr>
-            </w:pPr>
-            <w:r>
-              <w:rPr>
-                <w:rFonts w:ascii="Arial" w:hAnsi="Arial" w:cs="Arial"/>
-                <w:bCs/>
-                <w:sz w:val="16"/>
-                <w:szCs w:val="16"/>
+              </w:rPr>
+            </w:pPr>
+            <w:r>
+              <w:rPr>
+                <w:rFonts w:ascii="Arial" w:hAnsi="Arial" w:cs="Arial"/>
+                <w:bCs/>
               </w:rPr>
               <w:t xml:space="preserve"> </w:t>
             </w:r>
@@ -241,8 +213,6 @@
               <w:rPr>
                 <w:rFonts w:ascii="Arial" w:hAnsi="Arial" w:cs="Arial"/>
                 <w:b/>
-                <w:sz w:val="16"/>
-                <w:szCs w:val="16"/>
               </w:rPr>
               <w:t>Status atual:</w:t>
             </w:r>
@@ -259,8 +229,6 @@
               <w:rPr>
                 <w:rFonts w:ascii="Arial" w:hAnsi="Arial" w:cs="Arial"/>
                 <w:b/>
-                <w:sz w:val="16"/>
-                <w:szCs w:val="16"/>
               </w:rPr>
             </w:pPr>
           </w:p>
@@ -284,17 +252,13 @@
               <w:rPr>
                 <w:rFonts w:ascii="Arial" w:hAnsi="Arial" w:cs="Arial"/>
                 <w:bCs/>
-                <w:sz w:val="16"/>
-                <w:szCs w:val="16"/>
-              </w:rPr>
-            </w:pPr>
-            <w:r>
-              <w:rPr>
-                <w:rFonts w:ascii="Arial" w:hAnsi="Arial" w:cs="Arial"/>
-                <w:b/>
-                <w:bCs/>
-                <w:sz w:val="16"/>
-                <w:szCs w:val="16"/>
+              </w:rPr>
+            </w:pPr>
+            <w:r>
+              <w:rPr>
+                <w:rFonts w:ascii="Arial" w:hAnsi="Arial" w:cs="Arial"/>
+                <w:b/>
+                <w:bCs/>
               </w:rPr>
               <w:t>IDENTIFICAÇÃO DO CLIENTE</w:t>
             </w:r>
@@ -315,16 +279,12 @@
               <w:rPr>
                 <w:rFonts w:ascii="Arial" w:hAnsi="Arial" w:cs="Arial"/>
                 <w:b/>
-                <w:sz w:val="16"/>
-                <w:szCs w:val="16"/>
-              </w:rPr>
-            </w:pPr>
-            <w:r>
-              <w:rPr>
-                <w:rFonts w:ascii="Arial" w:hAnsi="Arial" w:cs="Arial"/>
-                <w:b/>
-                <w:sz w:val="16"/>
-                <w:szCs w:val="16"/>
+              </w:rPr>
+            </w:pPr>
+            <w:r>
+              <w:rPr>
+                <w:rFonts w:ascii="Arial" w:hAnsi="Arial" w:cs="Arial"/>
+                <w:b/>
               </w:rPr>
               <w:t>Nome cliente consumidor:</w:t>
             </w:r>
@@ -342,16 +302,12 @@
               <w:rPr>
                 <w:rFonts w:ascii="Arial" w:hAnsi="Arial" w:cs="Arial"/>
                 <w:bCs/>
-                <w:sz w:val="16"/>
-                <w:szCs w:val="16"/>
-              </w:rPr>
-            </w:pPr>
-            <w:r>
-              <w:rPr>
-                <w:rFonts w:ascii="Arial" w:hAnsi="Arial" w:cs="Arial"/>
-                <w:b/>
-                <w:sz w:val="16"/>
-                <w:szCs w:val="16"/>
+              </w:rPr>
+            </w:pPr>
+            <w:r>
+              <w:rPr>
+                <w:rFonts w:ascii="Arial" w:hAnsi="Arial" w:cs="Arial"/>
+                <w:b/>
               </w:rPr>
               <w:t xml:space="preserve"> </w:t>
             </w:r>
@@ -376,16 +332,12 @@
               <w:rPr>
                 <w:rFonts w:ascii="Arial" w:hAnsi="Arial" w:cs="Arial"/>
                 <w:b/>
-                <w:sz w:val="16"/>
-                <w:szCs w:val="16"/>
-              </w:rPr>
-            </w:pPr>
-            <w:r>
-              <w:rPr>
-                <w:rFonts w:ascii="Arial" w:hAnsi="Arial" w:cs="Arial"/>
-                <w:b/>
-                <w:sz w:val="16"/>
-                <w:szCs w:val="16"/>
+              </w:rPr>
+            </w:pPr>
+            <w:r>
+              <w:rPr>
+                <w:rFonts w:ascii="Arial" w:hAnsi="Arial" w:cs="Arial"/>
+                <w:b/>
               </w:rPr>
               <w:t>Nome cliente revendedor</w:t>
             </w:r>
@@ -403,8 +355,6 @@
               <w:rPr>
                 <w:rFonts w:ascii="Arial" w:hAnsi="Arial" w:cs="Arial"/>
                 <w:bCs/>
-                <w:sz w:val="16"/>
-                <w:szCs w:val="16"/>
               </w:rPr>
             </w:pPr>
           </w:p>
@@ -427,16 +377,12 @@
               <w:rPr>
                 <w:rFonts w:ascii="Arial" w:hAnsi="Arial" w:cs="Arial"/>
                 <w:b/>
-                <w:sz w:val="16"/>
-                <w:szCs w:val="16"/>
-              </w:rPr>
-            </w:pPr>
-            <w:r>
-              <w:rPr>
-                <w:rFonts w:ascii="Arial" w:hAnsi="Arial" w:cs="Arial"/>
-                <w:b/>
-                <w:sz w:val="16"/>
-                <w:szCs w:val="16"/>
+              </w:rPr>
+            </w:pPr>
+            <w:r>
+              <w:rPr>
+                <w:rFonts w:ascii="Arial" w:hAnsi="Arial" w:cs="Arial"/>
+                <w:b/>
               </w:rPr>
               <w:t>Contato:</w:t>
             </w:r>
@@ -457,16 +403,12 @@
               <w:rPr>
                 <w:rFonts w:ascii="Arial" w:hAnsi="Arial" w:cs="Arial"/>
                 <w:bCs/>
-                <w:sz w:val="16"/>
-                <w:szCs w:val="16"/>
-              </w:rPr>
-            </w:pPr>
-            <w:r>
-              <w:rPr>
-                <w:rFonts w:ascii="Arial" w:hAnsi="Arial" w:cs="Arial"/>
-                <w:bCs/>
-                <w:sz w:val="16"/>
-                <w:szCs w:val="16"/>
+              </w:rPr>
+            </w:pPr>
+            <w:r>
+              <w:rPr>
+                <w:rFonts w:ascii="Arial" w:hAnsi="Arial" w:cs="Arial"/>
+                <w:bCs/>
               </w:rPr>
               <w:t xml:space="preserve"> </w:t>
             </w:r>
@@ -495,16 +437,12 @@
               <w:rPr>
                 <w:rFonts w:ascii="Arial" w:hAnsi="Arial" w:cs="Arial"/>
                 <w:b/>
-                <w:sz w:val="16"/>
-                <w:szCs w:val="16"/>
-              </w:rPr>
-            </w:pPr>
-            <w:r>
-              <w:rPr>
-                <w:rFonts w:ascii="Arial" w:hAnsi="Arial" w:cs="Arial"/>
-                <w:b/>
-                <w:sz w:val="16"/>
-                <w:szCs w:val="16"/>
+              </w:rPr>
+            </w:pPr>
+            <w:r>
+              <w:rPr>
+                <w:rFonts w:ascii="Arial" w:hAnsi="Arial" w:cs="Arial"/>
+                <w:b/>
               </w:rPr>
               <w:t>Cidade</w:t>
             </w:r>
@@ -512,8 +450,6 @@
               <w:rPr>
                 <w:rFonts w:ascii="Arial" w:hAnsi="Arial" w:cs="Arial"/>
                 <w:b/>
-                <w:sz w:val="16"/>
-                <w:szCs w:val="16"/>
               </w:rPr>
               <w:t>:</w:t>
             </w:r>
@@ -534,8 +470,6 @@
               <w:rPr>
                 <w:rFonts w:ascii="Arial" w:hAnsi="Arial" w:cs="Arial"/>
                 <w:bCs/>
-                <w:sz w:val="16"/>
-                <w:szCs w:val="16"/>
               </w:rPr>
             </w:pPr>
           </w:p>
@@ -558,16 +492,12 @@
               <w:rPr>
                 <w:rFonts w:ascii="Arial" w:hAnsi="Arial" w:cs="Arial"/>
                 <w:b/>
-                <w:sz w:val="16"/>
-                <w:szCs w:val="16"/>
-              </w:rPr>
-            </w:pPr>
-            <w:r>
-              <w:rPr>
-                <w:rFonts w:ascii="Arial" w:hAnsi="Arial" w:cs="Arial"/>
-                <w:b/>
-                <w:sz w:val="16"/>
-                <w:szCs w:val="16"/>
+              </w:rPr>
+            </w:pPr>
+            <w:r>
+              <w:rPr>
+                <w:rFonts w:ascii="Arial" w:hAnsi="Arial" w:cs="Arial"/>
+                <w:b/>
               </w:rPr>
               <w:t>Telefone:</w:t>
             </w:r>
@@ -588,16 +518,12 @@
               <w:rPr>
                 <w:rFonts w:ascii="Arial" w:hAnsi="Arial" w:cs="Arial"/>
                 <w:bCs/>
-                <w:sz w:val="16"/>
-                <w:szCs w:val="16"/>
-              </w:rPr>
-            </w:pPr>
-            <w:r>
-              <w:rPr>
-                <w:rFonts w:ascii="Arial" w:hAnsi="Arial" w:cs="Arial"/>
-                <w:bCs/>
-                <w:sz w:val="16"/>
-                <w:szCs w:val="16"/>
+              </w:rPr>
+            </w:pPr>
+            <w:r>
+              <w:rPr>
+                <w:rFonts w:ascii="Arial" w:hAnsi="Arial" w:cs="Arial"/>
+                <w:bCs/>
               </w:rPr>
               <w:t xml:space="preserve"> </w:t>
             </w:r>
@@ -629,16 +555,12 @@
               <w:rPr>
                 <w:rFonts w:ascii="Arial" w:hAnsi="Arial" w:cs="Arial"/>
                 <w:b/>
-                <w:sz w:val="16"/>
-                <w:szCs w:val="16"/>
-              </w:rPr>
-            </w:pPr>
-            <w:r>
-              <w:rPr>
-                <w:rFonts w:ascii="Arial" w:hAnsi="Arial" w:cs="Arial"/>
-                <w:b/>
-                <w:sz w:val="16"/>
-                <w:szCs w:val="16"/>
+              </w:rPr>
+            </w:pPr>
+            <w:r>
+              <w:rPr>
+                <w:rFonts w:ascii="Arial" w:hAnsi="Arial" w:cs="Arial"/>
+                <w:b/>
               </w:rPr>
               <w:t>Bairro:</w:t>
             </w:r>
@@ -659,8 +581,6 @@
               <w:rPr>
                 <w:rFonts w:ascii="Arial" w:hAnsi="Arial" w:cs="Arial"/>
                 <w:bCs/>
-                <w:sz w:val="16"/>
-                <w:szCs w:val="16"/>
               </w:rPr>
             </w:pPr>
           </w:p>
@@ -683,16 +603,12 @@
               <w:rPr>
                 <w:rFonts w:ascii="Arial" w:hAnsi="Arial" w:cs="Arial"/>
                 <w:b/>
-                <w:sz w:val="16"/>
-                <w:szCs w:val="16"/>
-              </w:rPr>
-            </w:pPr>
-            <w:r>
-              <w:rPr>
-                <w:rFonts w:ascii="Arial" w:hAnsi="Arial" w:cs="Arial"/>
-                <w:b/>
-                <w:sz w:val="16"/>
-                <w:szCs w:val="16"/>
+              </w:rPr>
+            </w:pPr>
+            <w:r>
+              <w:rPr>
+                <w:rFonts w:ascii="Arial" w:hAnsi="Arial" w:cs="Arial"/>
+                <w:b/>
               </w:rPr>
               <w:t>Endereço:</w:t>
             </w:r>
@@ -713,8 +629,6 @@
               <w:rPr>
                 <w:rFonts w:ascii="Arial" w:hAnsi="Arial" w:cs="Arial"/>
                 <w:bCs/>
-                <w:sz w:val="16"/>
-                <w:szCs w:val="16"/>
               </w:rPr>
             </w:pPr>
           </w:p>
@@ -735,16 +649,12 @@
               <w:rPr>
                 <w:rFonts w:ascii="Arial" w:hAnsi="Arial" w:cs="Arial"/>
                 <w:b/>
-                <w:sz w:val="16"/>
-                <w:szCs w:val="16"/>
-              </w:rPr>
-            </w:pPr>
-            <w:r>
-              <w:rPr>
-                <w:rFonts w:ascii="Arial" w:hAnsi="Arial" w:cs="Arial"/>
-                <w:b/>
-                <w:sz w:val="16"/>
-                <w:szCs w:val="16"/>
+              </w:rPr>
+            </w:pPr>
+            <w:r>
+              <w:rPr>
+                <w:rFonts w:ascii="Arial" w:hAnsi="Arial" w:cs="Arial"/>
+                <w:b/>
               </w:rPr>
               <w:t>Ponto De Referência:</w:t>
             </w:r>
@@ -765,8 +675,6 @@
               <w:rPr>
                 <w:rFonts w:ascii="Arial" w:hAnsi="Arial" w:cs="Arial"/>
                 <w:bCs/>
-                <w:sz w:val="16"/>
-                <w:szCs w:val="16"/>
               </w:rPr>
             </w:pPr>
           </w:p>
@@ -794,17 +702,13 @@
                 <w:rFonts w:ascii="Arial" w:hAnsi="Arial" w:cs="Arial"/>
                 <w:b/>
                 <w:bCs/>
-                <w:sz w:val="16"/>
-                <w:szCs w:val="16"/>
-              </w:rPr>
-            </w:pPr>
-            <w:r>
-              <w:rPr>
-                <w:rFonts w:ascii="Arial" w:hAnsi="Arial" w:cs="Arial"/>
-                <w:b/>
-                <w:bCs/>
-                <w:sz w:val="16"/>
-                <w:szCs w:val="16"/>
+              </w:rPr>
+            </w:pPr>
+            <w:r>
+              <w:rPr>
+                <w:rFonts w:ascii="Arial" w:hAnsi="Arial" w:cs="Arial"/>
+                <w:b/>
+                <w:bCs/>
               </w:rPr>
               <w:t>IDENTIFICAÇÃO DO PRODUTO</w:t>
             </w:r>
@@ -830,17 +734,13 @@
                 <w:rFonts w:ascii="Arial" w:hAnsi="Arial" w:cs="Arial"/>
                 <w:b/>
                 <w:bCs/>
-                <w:sz w:val="16"/>
-                <w:szCs w:val="16"/>
-              </w:rPr>
-            </w:pPr>
-            <w:r>
-              <w:rPr>
-                <w:rFonts w:ascii="Arial" w:hAnsi="Arial" w:cs="Arial"/>
-                <w:b/>
-                <w:bCs/>
-                <w:sz w:val="16"/>
-                <w:szCs w:val="16"/>
+              </w:rPr>
+            </w:pPr>
+            <w:r>
+              <w:rPr>
+                <w:rFonts w:ascii="Arial" w:hAnsi="Arial" w:cs="Arial"/>
+                <w:b/>
+                <w:bCs/>
               </w:rPr>
               <w:t>Produto:</w:t>
             </w:r>
@@ -861,8 +761,6 @@
                 <w:rFonts w:ascii="Arial" w:hAnsi="Arial" w:cs="Arial"/>
                 <w:b/>
                 <w:bCs/>
-                <w:sz w:val="16"/>
-                <w:szCs w:val="16"/>
               </w:rPr>
             </w:pPr>
           </w:p>
@@ -882,17 +780,13 @@
                 <w:rFonts w:ascii="Arial" w:hAnsi="Arial" w:cs="Arial"/>
                 <w:b/>
                 <w:bCs/>
-                <w:sz w:val="16"/>
-                <w:szCs w:val="16"/>
-              </w:rPr>
-            </w:pPr>
-            <w:r>
-              <w:rPr>
-                <w:rFonts w:ascii="Arial" w:hAnsi="Arial" w:cs="Arial"/>
-                <w:b/>
-                <w:bCs/>
-                <w:sz w:val="16"/>
-                <w:szCs w:val="16"/>
+              </w:rPr>
+            </w:pPr>
+            <w:r>
+              <w:rPr>
+                <w:rFonts w:ascii="Arial" w:hAnsi="Arial" w:cs="Arial"/>
+                <w:b/>
+                <w:bCs/>
               </w:rPr>
               <w:t>Nº Série/Lote Do Produto:</w:t>
             </w:r>
@@ -913,8 +807,6 @@
                 <w:rFonts w:ascii="Arial" w:hAnsi="Arial" w:cs="Arial"/>
                 <w:b/>
                 <w:bCs/>
-                <w:sz w:val="16"/>
-                <w:szCs w:val="16"/>
               </w:rPr>
             </w:pPr>
           </w:p>
@@ -939,17 +831,13 @@
                 <w:rFonts w:ascii="Arial" w:hAnsi="Arial" w:cs="Arial"/>
                 <w:b/>
                 <w:bCs/>
-                <w:sz w:val="16"/>
-                <w:szCs w:val="16"/>
-              </w:rPr>
-            </w:pPr>
-            <w:r>
-              <w:rPr>
-                <w:rFonts w:ascii="Arial" w:hAnsi="Arial" w:cs="Arial"/>
-                <w:b/>
-                <w:bCs/>
-                <w:sz w:val="16"/>
-                <w:szCs w:val="16"/>
+              </w:rPr>
+            </w:pPr>
+            <w:r>
+              <w:rPr>
+                <w:rFonts w:ascii="Arial" w:hAnsi="Arial" w:cs="Arial"/>
+                <w:b/>
+                <w:bCs/>
               </w:rPr>
               <w:t xml:space="preserve">Data Emissão </w:t>
             </w:r>
@@ -959,8 +847,6 @@
                 <w:rFonts w:ascii="Arial" w:hAnsi="Arial" w:cs="Arial"/>
                 <w:b/>
                 <w:bCs/>
-                <w:sz w:val="16"/>
-                <w:szCs w:val="16"/>
               </w:rPr>
               <w:t>Nf</w:t>
             </w:r>
@@ -970,8 +856,6 @@
                 <w:rFonts w:ascii="Arial" w:hAnsi="Arial" w:cs="Arial"/>
                 <w:b/>
                 <w:bCs/>
-                <w:sz w:val="16"/>
-                <w:szCs w:val="16"/>
               </w:rPr>
               <w:t>:</w:t>
             </w:r>
@@ -992,8 +876,6 @@
                 <w:rFonts w:ascii="Arial" w:hAnsi="Arial" w:cs="Arial"/>
                 <w:b/>
                 <w:bCs/>
-                <w:sz w:val="16"/>
-                <w:szCs w:val="16"/>
               </w:rPr>
             </w:pPr>
           </w:p>
@@ -1013,17 +895,13 @@
                 <w:rFonts w:ascii="Arial" w:hAnsi="Arial" w:cs="Arial"/>
                 <w:b/>
                 <w:bCs/>
-                <w:sz w:val="16"/>
-                <w:szCs w:val="16"/>
-              </w:rPr>
-            </w:pPr>
-            <w:r>
-              <w:rPr>
-                <w:rFonts w:ascii="Arial" w:hAnsi="Arial" w:cs="Arial"/>
-                <w:b/>
-                <w:bCs/>
-                <w:sz w:val="16"/>
-                <w:szCs w:val="16"/>
+              </w:rPr>
+            </w:pPr>
+            <w:r>
+              <w:rPr>
+                <w:rFonts w:ascii="Arial" w:hAnsi="Arial" w:cs="Arial"/>
+                <w:b/>
+                <w:bCs/>
               </w:rPr>
               <w:t>Nota Fiscal Nº:</w:t>
             </w:r>
@@ -1044,8 +922,6 @@
                 <w:rFonts w:ascii="Arial" w:hAnsi="Arial" w:cs="Arial"/>
                 <w:b/>
                 <w:bCs/>
-                <w:sz w:val="16"/>
-                <w:szCs w:val="16"/>
               </w:rPr>
             </w:pPr>
           </w:p>
@@ -1070,17 +946,13 @@
                 <w:rFonts w:ascii="Arial" w:hAnsi="Arial" w:cs="Arial"/>
                 <w:b/>
                 <w:bCs/>
-                <w:sz w:val="16"/>
-                <w:szCs w:val="16"/>
-              </w:rPr>
-            </w:pPr>
-            <w:r>
-              <w:rPr>
-                <w:rFonts w:ascii="Arial" w:hAnsi="Arial" w:cs="Arial"/>
-                <w:b/>
-                <w:bCs/>
-                <w:sz w:val="16"/>
-                <w:szCs w:val="16"/>
+              </w:rPr>
+            </w:pPr>
+            <w:r>
+              <w:rPr>
+                <w:rFonts w:ascii="Arial" w:hAnsi="Arial" w:cs="Arial"/>
+                <w:b/>
+                <w:bCs/>
               </w:rPr>
               <w:t>Quantidade:</w:t>
             </w:r>
@@ -1101,8 +973,6 @@
                 <w:rFonts w:ascii="Arial" w:hAnsi="Arial" w:cs="Arial"/>
                 <w:b/>
                 <w:bCs/>
-                <w:sz w:val="16"/>
-                <w:szCs w:val="16"/>
               </w:rPr>
             </w:pPr>
           </w:p>
@@ -1122,17 +992,13 @@
                 <w:rFonts w:ascii="Arial" w:hAnsi="Arial" w:cs="Arial"/>
                 <w:b/>
                 <w:bCs/>
-                <w:sz w:val="16"/>
-                <w:szCs w:val="16"/>
-              </w:rPr>
-            </w:pPr>
-            <w:r>
-              <w:rPr>
-                <w:rFonts w:ascii="Arial" w:hAnsi="Arial" w:cs="Arial"/>
-                <w:b/>
-                <w:bCs/>
-                <w:sz w:val="16"/>
-                <w:szCs w:val="16"/>
+              </w:rPr>
+            </w:pPr>
+            <w:r>
+              <w:rPr>
+                <w:rFonts w:ascii="Arial" w:hAnsi="Arial" w:cs="Arial"/>
+                <w:b/>
+                <w:bCs/>
               </w:rPr>
               <w:t>Pedido Nº:</w:t>
             </w:r>
@@ -1153,8 +1019,6 @@
                 <w:rFonts w:ascii="Arial" w:hAnsi="Arial" w:cs="Arial"/>
                 <w:b/>
                 <w:bCs/>
-                <w:sz w:val="16"/>
-                <w:szCs w:val="16"/>
               </w:rPr>
             </w:pPr>
           </w:p>
@@ -1179,17 +1043,13 @@
                 <w:rFonts w:ascii="Arial" w:hAnsi="Arial" w:cs="Arial"/>
                 <w:b/>
                 <w:bCs/>
-                <w:sz w:val="16"/>
-                <w:szCs w:val="16"/>
-              </w:rPr>
-            </w:pPr>
-            <w:r>
-              <w:rPr>
-                <w:rFonts w:ascii="Arial" w:hAnsi="Arial" w:cs="Arial"/>
-                <w:b/>
-                <w:bCs/>
-                <w:sz w:val="16"/>
-                <w:szCs w:val="16"/>
+              </w:rPr>
+            </w:pPr>
+            <w:r>
+              <w:rPr>
+                <w:rFonts w:ascii="Arial" w:hAnsi="Arial" w:cs="Arial"/>
+                <w:b/>
+                <w:bCs/>
               </w:rPr>
               <w:t>1 - RECLAMAÇÃO / SUGESTÃO</w:t>
             </w:r>
@@ -1215,17 +1075,13 @@
                 <w:rFonts w:ascii="Arial" w:hAnsi="Arial" w:cs="Arial"/>
                 <w:b/>
                 <w:bCs/>
-                <w:sz w:val="16"/>
-                <w:szCs w:val="16"/>
-              </w:rPr>
-            </w:pPr>
-            <w:r>
-              <w:rPr>
-                <w:rFonts w:ascii="Arial" w:hAnsi="Arial" w:cs="Arial"/>
-                <w:b/>
-                <w:bCs/>
-                <w:sz w:val="16"/>
-                <w:szCs w:val="16"/>
+              </w:rPr>
+            </w:pPr>
+            <w:r>
+              <w:rPr>
+                <w:rFonts w:ascii="Arial" w:hAnsi="Arial" w:cs="Arial"/>
+                <w:b/>
+                <w:bCs/>
               </w:rPr>
               <w:t>Tipo de reclamação</w:t>
             </w:r>
@@ -1246,8 +1102,6 @@
                 <w:rFonts w:ascii="Arial" w:hAnsi="Arial" w:cs="Arial"/>
                 <w:b/>
                 <w:bCs/>
-                <w:sz w:val="16"/>
-                <w:szCs w:val="16"/>
               </w:rPr>
             </w:pPr>
           </w:p>
@@ -1272,17 +1126,13 @@
                 <w:rFonts w:ascii="Arial" w:hAnsi="Arial" w:cs="Arial"/>
                 <w:b/>
                 <w:bCs/>
-                <w:sz w:val="16"/>
-                <w:szCs w:val="16"/>
-              </w:rPr>
-            </w:pPr>
-            <w:r>
-              <w:rPr>
-                <w:rFonts w:ascii="Arial" w:hAnsi="Arial" w:cs="Arial"/>
-                <w:b/>
-                <w:bCs/>
-                <w:sz w:val="16"/>
-                <w:szCs w:val="16"/>
+              </w:rPr>
+            </w:pPr>
+            <w:r>
+              <w:rPr>
+                <w:rFonts w:ascii="Arial" w:hAnsi="Arial" w:cs="Arial"/>
+                <w:b/>
+                <w:bCs/>
               </w:rPr>
               <w:t>DESCRIÇÃO DA RECLAMAÇÃO:</w:t>
             </w:r>
@@ -1308,8 +1158,6 @@
                 <w:rFonts w:ascii="Arial" w:hAnsi="Arial" w:cs="Arial"/>
                 <w:b/>
                 <w:bCs/>
-                <w:sz w:val="16"/>
-                <w:szCs w:val="16"/>
               </w:rPr>
             </w:pPr>
           </w:p>
@@ -1334,17 +1182,13 @@
                 <w:rFonts w:ascii="Arial" w:hAnsi="Arial" w:cs="Arial"/>
                 <w:b/>
                 <w:bCs/>
-                <w:sz w:val="16"/>
-                <w:szCs w:val="16"/>
-              </w:rPr>
-            </w:pPr>
-            <w:r>
-              <w:rPr>
-                <w:rFonts w:ascii="Arial" w:hAnsi="Arial" w:cs="Arial"/>
-                <w:b/>
-                <w:bCs/>
-                <w:sz w:val="16"/>
-                <w:szCs w:val="16"/>
+              </w:rPr>
+            </w:pPr>
+            <w:r>
+              <w:rPr>
+                <w:rFonts w:ascii="Arial" w:hAnsi="Arial" w:cs="Arial"/>
+                <w:b/>
+                <w:bCs/>
               </w:rPr>
               <w:t>2 – ANÁLISE DA RECLAMAÇÃO</w:t>
             </w:r>
@@ -1370,17 +1214,13 @@
                 <w:rFonts w:ascii="Arial" w:hAnsi="Arial" w:cs="Arial"/>
                 <w:b/>
                 <w:bCs/>
-                <w:sz w:val="16"/>
-                <w:szCs w:val="16"/>
-              </w:rPr>
-            </w:pPr>
-            <w:r>
-              <w:rPr>
-                <w:rFonts w:ascii="Arial" w:hAnsi="Arial" w:cs="Arial"/>
-                <w:b/>
-                <w:bCs/>
-                <w:sz w:val="16"/>
-                <w:szCs w:val="16"/>
+              </w:rPr>
+            </w:pPr>
+            <w:r>
+              <w:rPr>
+                <w:rFonts w:ascii="Arial" w:hAnsi="Arial" w:cs="Arial"/>
+                <w:b/>
+                <w:bCs/>
               </w:rPr>
               <w:t>Reclamação Aceita?</w:t>
             </w:r>
@@ -1401,8 +1241,6 @@
                 <w:rFonts w:ascii="Arial" w:hAnsi="Arial" w:cs="Arial"/>
                 <w:b/>
                 <w:bCs/>
-                <w:sz w:val="16"/>
-                <w:szCs w:val="16"/>
               </w:rPr>
             </w:pPr>
           </w:p>
@@ -1422,17 +1260,13 @@
                 <w:rFonts w:ascii="Arial" w:hAnsi="Arial" w:cs="Arial"/>
                 <w:b/>
                 <w:bCs/>
-                <w:sz w:val="16"/>
-                <w:szCs w:val="16"/>
-              </w:rPr>
-            </w:pPr>
-            <w:r>
-              <w:rPr>
-                <w:rFonts w:ascii="Arial" w:hAnsi="Arial" w:cs="Arial"/>
-                <w:b/>
-                <w:bCs/>
-                <w:sz w:val="16"/>
-                <w:szCs w:val="16"/>
+              </w:rPr>
+            </w:pPr>
+            <w:r>
+              <w:rPr>
+                <w:rFonts w:ascii="Arial" w:hAnsi="Arial" w:cs="Arial"/>
+                <w:b/>
+                <w:bCs/>
               </w:rPr>
               <w:t>Dentro da garantia?</w:t>
             </w:r>
@@ -1453,8 +1287,6 @@
                 <w:rFonts w:ascii="Arial" w:hAnsi="Arial" w:cs="Arial"/>
                 <w:b/>
                 <w:bCs/>
-                <w:sz w:val="16"/>
-                <w:szCs w:val="16"/>
               </w:rPr>
             </w:pPr>
           </w:p>
@@ -1474,17 +1306,13 @@
                 <w:rFonts w:ascii="Arial" w:hAnsi="Arial" w:cs="Arial"/>
                 <w:b/>
                 <w:bCs/>
-                <w:sz w:val="16"/>
-                <w:szCs w:val="16"/>
-              </w:rPr>
-            </w:pPr>
-            <w:r>
-              <w:rPr>
-                <w:rFonts w:ascii="Arial" w:hAnsi="Arial" w:cs="Arial"/>
-                <w:b/>
-                <w:bCs/>
-                <w:sz w:val="16"/>
-                <w:szCs w:val="16"/>
+              </w:rPr>
+            </w:pPr>
+            <w:r>
+              <w:rPr>
+                <w:rFonts w:ascii="Arial" w:hAnsi="Arial" w:cs="Arial"/>
+                <w:b/>
+                <w:bCs/>
               </w:rPr>
               <w:t>Abrir Ordem De Serviço?</w:t>
             </w:r>
@@ -1505,65 +1333,6 @@
                 <w:rFonts w:ascii="Arial" w:hAnsi="Arial" w:cs="Arial"/>
                 <w:b/>
                 <w:bCs/>
-                <w:sz w:val="16"/>
-                <w:szCs w:val="16"/>
-              </w:rPr>
-            </w:pPr>
-          </w:p>
-        </w:tc>
-      </w:tr>
-      <w:tr>
-        <w:trPr>
-          <w:trHeight w:val="1696"/>
-        </w:trPr>
-        <w:tc>
-          <w:tcPr>
-            <w:tcW w:w="1936" w:type="dxa"/>
-            <w:gridSpan w:val="2"/>
-            <w:shd w:val="clear" w:color="auto" w:fill="F2F2F2" w:themeFill="background1" w:themeFillShade="F2"/>
-            <w:vAlign w:val="center"/>
-          </w:tcPr>
-          <w:p>
-            <w:pPr>
-              <w:ind w:left="-129"/>
-              <w:jc w:val="center"/>
-              <w:rPr>
-                <w:rFonts w:ascii="Arial" w:hAnsi="Arial" w:cs="Arial"/>
-                <w:b/>
-                <w:bCs/>
-                <w:sz w:val="16"/>
-                <w:szCs w:val="16"/>
-              </w:rPr>
-            </w:pPr>
-            <w:r>
-              <w:rPr>
-                <w:rFonts w:ascii="Arial" w:hAnsi="Arial" w:cs="Arial"/>
-                <w:b/>
-                <w:bCs/>
-                <w:sz w:val="16"/>
-                <w:szCs w:val="16"/>
-              </w:rPr>
-              <w:t>Comentário</w:t>
-            </w:r>
-          </w:p>
-        </w:tc>
-        <w:tc>
-          <w:tcPr>
-            <w:tcW w:w="9683" w:type="dxa"/>
-            <w:gridSpan w:val="14"/>
-            <w:shd w:val="clear" w:color="auto" w:fill="F2F2F2" w:themeFill="background1" w:themeFillShade="F2"/>
-            <w:vAlign w:val="center"/>
-          </w:tcPr>
-          <w:p>
-            <w:pPr>
-              <w:ind w:left="-129"/>
-              <w:jc w:val="center"/>
-              <w:rPr>
-                <w:rFonts w:ascii="Arial" w:hAnsi="Arial" w:cs="Arial"/>
-                <w:b/>
-                <w:bCs/>
-                <w:sz w:val="16"/>
-                <w:szCs w:val="16"/>
               </w:rPr>
             </w:pPr>
           </w:p>
@@ -1588,8 +1357,6 @@
                 <w:rFonts w:ascii="Arial" w:hAnsi="Arial" w:cs="Arial"/>
                 <w:b/>
                 <w:bCs/>
-                <w:sz w:val="16"/>
-                <w:szCs w:val="16"/>
               </w:rPr>
             </w:pPr>
             <w:r>
@@ -1598,8 +1365,6 @@
                 <w:b/>
                 <w:bCs/>
                 <w:i/>
-                <w:sz w:val="16"/>
-                <w:szCs w:val="16"/>
               </w:rPr>
               <w:t>Responsável pela análise</w:t>
             </w:r>
@@ -1620,8 +1385,6 @@
                 <w:rFonts w:ascii="Arial" w:hAnsi="Arial" w:cs="Arial"/>
                 <w:b/>
                 <w:bCs/>
-                <w:sz w:val="16"/>
-                <w:szCs w:val="16"/>
               </w:rPr>
             </w:pPr>
           </w:p>
@@ -1646,17 +1409,13 @@
                 <w:rFonts w:ascii="Arial" w:hAnsi="Arial" w:cs="Arial"/>
                 <w:b/>
                 <w:bCs/>
-                <w:sz w:val="16"/>
-                <w:szCs w:val="16"/>
-              </w:rPr>
-            </w:pPr>
-            <w:r>
-              <w:rPr>
-                <w:rFonts w:ascii="Arial" w:hAnsi="Arial" w:cs="Arial"/>
-                <w:b/>
-                <w:bCs/>
-                <w:sz w:val="16"/>
-                <w:szCs w:val="16"/>
+              </w:rPr>
+            </w:pPr>
+            <w:r>
+              <w:rPr>
+                <w:rFonts w:ascii="Arial" w:hAnsi="Arial" w:cs="Arial"/>
+                <w:b/>
+                <w:bCs/>
               </w:rPr>
               <w:t>4 – CONFIRMAÇÃO DA REALIZAÇÃO DO SERVIÇO</w:t>
             </w:r>
@@ -1682,8 +1441,6 @@
                 <w:rFonts w:ascii="Arial" w:hAnsi="Arial" w:cs="Arial"/>
                 <w:b/>
                 <w:bCs/>
-                <w:sz w:val="16"/>
-                <w:szCs w:val="16"/>
               </w:rPr>
             </w:pPr>
           </w:p>
@@ -1703,8 +1460,6 @@
                 <w:rFonts w:ascii="Arial" w:hAnsi="Arial" w:cs="Arial"/>
                 <w:b/>
                 <w:bCs/>
-                <w:sz w:val="16"/>
-                <w:szCs w:val="16"/>
               </w:rPr>
             </w:pPr>
           </w:p>
@@ -1729,8 +1484,6 @@
                 <w:rFonts w:ascii="Arial" w:hAnsi="Arial" w:cs="Arial"/>
                 <w:b/>
                 <w:bCs/>
-                <w:sz w:val="16"/>
-                <w:szCs w:val="16"/>
               </w:rPr>
             </w:pPr>
             <w:r>
@@ -1739,8 +1492,6 @@
                 <w:b/>
                 <w:bCs/>
                 <w:i/>
-                <w:sz w:val="16"/>
-                <w:szCs w:val="16"/>
               </w:rPr>
               <w:t>Administração</w:t>
             </w:r>
@@ -1761,8 +1512,6 @@
                 <w:rFonts w:ascii="Arial" w:hAnsi="Arial" w:cs="Arial"/>
                 <w:b/>
                 <w:bCs/>
-                <w:sz w:val="16"/>
-                <w:szCs w:val="16"/>
               </w:rPr>
             </w:pPr>
             <w:r>
@@ -1771,8 +1520,6 @@
                 <w:b/>
                 <w:bCs/>
                 <w:i/>
-                <w:sz w:val="16"/>
-                <w:szCs w:val="16"/>
               </w:rPr>
               <w:t>Diretoria</w:t>
             </w:r>
@@ -1780,6 +1527,7 @@
         </w:tc>
       </w:tr>
     </w:tbl>
+    <w:p/>
     <w:sectPr>
       <w:headerReference w:type="even" r:id="rId7"/>
       <w:headerReference w:type="default" r:id="rId8"/>
@@ -2758,8 +2506,6 @@
     <w:rsid w:val="00FF0C29"/>
     <w:rPr>
       <w:rFonts w:ascii="Tahoma" w:hAnsi="Tahoma" w:cs="Tahoma"/>
-      <w:sz w:val="16"/>
-      <w:szCs w:val="16"/>
     </w:rPr>
   </w:style>
   <w:style w:type="character" w:customStyle="1" w:styleId="TextodebaloChar">
@@ -2793,10 +2539,6 @@
     <w:semiHidden/>
     <w:unhideWhenUsed/>
     <w:rsid w:val="00C67204"/>
-    <w:rPr>
-      <w:sz w:val="16"/>
-      <w:szCs w:val="16"/>
-    </w:rPr>
   </w:style>
   <w:style w:type="character" w:customStyle="1" w:styleId="TextodecomentrioChar">
     <w:name w:val="Texto de comentário Char"/>

</xml_diff>

<commit_message>
feat: atualiza RCC, calendario e dashboard de RH
Inclui os campos e o novo layout do PDF RCC, evolui o calendario do recurso 1000 e amplia os indicadores do dashboard de RH.

Co-authored-by: Cursor <cursoragent@cursor.com>
</commit_message>
<xml_diff>
--- a/backend/scripts/sgq/rcc-pdf/templates/cliente.docx
+++ b/backend/scripts/sgq/rcc-pdf/templates/cliente.docx
@@ -20,17 +20,20 @@
       <w:tblGrid>
         <w:gridCol w:w="1555"/>
         <w:gridCol w:w="381"/>
-        <w:gridCol w:w="968"/>
-        <w:gridCol w:w="210"/>
+        <w:gridCol w:w="684"/>
+        <w:gridCol w:w="352"/>
+        <w:gridCol w:w="142"/>
         <w:gridCol w:w="759"/>
         <w:gridCol w:w="800"/>
-        <w:gridCol w:w="1136"/>
-        <w:gridCol w:w="423"/>
+        <w:gridCol w:w="992"/>
+        <w:gridCol w:w="236"/>
+        <w:gridCol w:w="331"/>
         <w:gridCol w:w="426"/>
         <w:gridCol w:w="1088"/>
         <w:gridCol w:w="46"/>
-        <w:gridCol w:w="922"/>
-        <w:gridCol w:w="353"/>
+        <w:gridCol w:w="850"/>
+        <w:gridCol w:w="164"/>
+        <w:gridCol w:w="261"/>
         <w:gridCol w:w="615"/>
         <w:gridCol w:w="732"/>
         <w:gridCol w:w="1205"/>
@@ -42,7 +45,7 @@
         <w:tc>
           <w:tcPr>
             <w:tcW w:w="11619" w:type="dxa"/>
-            <w:gridSpan w:val="16"/>
+            <w:gridSpan w:val="19"/>
             <w:shd w:val="clear" w:color="auto" w:fill="D9D9D9"/>
             <w:vAlign w:val="center"/>
           </w:tcPr>
@@ -100,7 +103,7 @@
         <w:tc>
           <w:tcPr>
             <w:tcW w:w="1559" w:type="dxa"/>
-            <w:gridSpan w:val="3"/>
+            <w:gridSpan w:val="4"/>
             <w:vAlign w:val="center"/>
           </w:tcPr>
           <w:p>
@@ -137,7 +140,7 @@
         <w:tc>
           <w:tcPr>
             <w:tcW w:w="1559" w:type="dxa"/>
-            <w:gridSpan w:val="2"/>
+            <w:gridSpan w:val="3"/>
             <w:vAlign w:val="center"/>
           </w:tcPr>
           <w:p>
@@ -174,7 +177,7 @@
         <w:tc>
           <w:tcPr>
             <w:tcW w:w="1275" w:type="dxa"/>
-            <w:gridSpan w:val="2"/>
+            <w:gridSpan w:val="3"/>
             <w:vAlign w:val="center"/>
           </w:tcPr>
           <w:p>
@@ -241,7 +244,7 @@
         <w:tc>
           <w:tcPr>
             <w:tcW w:w="11619" w:type="dxa"/>
-            <w:gridSpan w:val="16"/>
+            <w:gridSpan w:val="19"/>
             <w:shd w:val="clear" w:color="auto" w:fill="D1D1D1" w:themeFill="background2" w:themeFillShade="E6"/>
             <w:vAlign w:val="center"/>
           </w:tcPr>
@@ -293,7 +296,7 @@
         <w:tc>
           <w:tcPr>
             <w:tcW w:w="5103" w:type="dxa"/>
-            <w:gridSpan w:val="8"/>
+            <w:gridSpan w:val="10"/>
             <w:vAlign w:val="center"/>
           </w:tcPr>
           <w:p>
@@ -322,7 +325,7 @@
         <w:tc>
           <w:tcPr>
             <w:tcW w:w="2409" w:type="dxa"/>
-            <w:gridSpan w:val="4"/>
+            <w:gridSpan w:val="5"/>
             <w:vAlign w:val="center"/>
           </w:tcPr>
           <w:p>
@@ -391,7 +394,7 @@
         <w:tc>
           <w:tcPr>
             <w:tcW w:w="5103" w:type="dxa"/>
-            <w:gridSpan w:val="8"/>
+            <w:gridSpan w:val="10"/>
             <w:tcBorders>
               <w:bottom w:val="single" w:sz="4" w:space="0" w:color="auto"/>
             </w:tcBorders>
@@ -458,7 +461,7 @@
         <w:tc>
           <w:tcPr>
             <w:tcW w:w="3827" w:type="dxa"/>
-            <w:gridSpan w:val="5"/>
+            <w:gridSpan w:val="6"/>
             <w:tcBorders>
               <w:bottom w:val="single" w:sz="4" w:space="0" w:color="auto"/>
             </w:tcBorders>
@@ -506,7 +509,7 @@
         <w:tc>
           <w:tcPr>
             <w:tcW w:w="5103" w:type="dxa"/>
-            <w:gridSpan w:val="8"/>
+            <w:gridSpan w:val="10"/>
             <w:tcBorders>
               <w:bottom w:val="single" w:sz="4" w:space="0" w:color="auto"/>
             </w:tcBorders>
@@ -569,7 +572,7 @@
         <w:tc>
           <w:tcPr>
             <w:tcW w:w="3827" w:type="dxa"/>
-            <w:gridSpan w:val="5"/>
+            <w:gridSpan w:val="6"/>
             <w:tcBorders>
               <w:bottom w:val="single" w:sz="4" w:space="0" w:color="auto"/>
             </w:tcBorders>
@@ -617,7 +620,7 @@
         <w:tc>
           <w:tcPr>
             <w:tcW w:w="5103" w:type="dxa"/>
-            <w:gridSpan w:val="8"/>
+            <w:gridSpan w:val="10"/>
             <w:tcBorders>
               <w:bottom w:val="single" w:sz="4" w:space="0" w:color="auto"/>
             </w:tcBorders>
@@ -663,7 +666,7 @@
         <w:tc>
           <w:tcPr>
             <w:tcW w:w="3827" w:type="dxa"/>
-            <w:gridSpan w:val="5"/>
+            <w:gridSpan w:val="6"/>
             <w:tcBorders>
               <w:bottom w:val="single" w:sz="4" w:space="0" w:color="auto"/>
             </w:tcBorders>
@@ -687,7 +690,7 @@
         <w:tc>
           <w:tcPr>
             <w:tcW w:w="11619" w:type="dxa"/>
-            <w:gridSpan w:val="16"/>
+            <w:gridSpan w:val="19"/>
             <w:tcBorders>
               <w:bottom w:val="single" w:sz="4" w:space="0" w:color="auto"/>
             </w:tcBorders>
@@ -721,7 +724,7 @@
         </w:trPr>
         <w:tc>
           <w:tcPr>
-            <w:tcW w:w="2904" w:type="dxa"/>
+            <w:tcW w:w="2620" w:type="dxa"/>
             <w:gridSpan w:val="3"/>
             <w:shd w:val="clear" w:color="auto" w:fill="FFFFFF" w:themeFill="background1"/>
             <w:vAlign w:val="center"/>
@@ -748,8 +751,27 @@
         </w:tc>
         <w:tc>
           <w:tcPr>
+            <w:tcW w:w="3281" w:type="dxa"/>
+            <w:gridSpan w:val="6"/>
+            <w:shd w:val="clear" w:color="auto" w:fill="FFFFFF" w:themeFill="background1"/>
+            <w:vAlign w:val="center"/>
+          </w:tcPr>
+          <w:p>
+            <w:pPr>
+              <w:ind w:left="-129"/>
+              <w:jc w:val="center"/>
+              <w:rPr>
+                <w:rFonts w:ascii="Arial" w:hAnsi="Arial" w:cs="Arial"/>
+                <w:b/>
+                <w:bCs/>
+              </w:rPr>
+            </w:pPr>
+          </w:p>
+        </w:tc>
+        <w:tc>
+          <w:tcPr>
             <w:tcW w:w="2905" w:type="dxa"/>
-            <w:gridSpan w:val="4"/>
+            <w:gridSpan w:val="6"/>
             <w:shd w:val="clear" w:color="auto" w:fill="FFFFFF" w:themeFill="background1"/>
             <w:vAlign w:val="center"/>
           </w:tcPr>
@@ -763,25 +785,6 @@
                 <w:bCs/>
               </w:rPr>
             </w:pPr>
-          </w:p>
-        </w:tc>
-        <w:tc>
-          <w:tcPr>
-            <w:tcW w:w="2905" w:type="dxa"/>
-            <w:gridSpan w:val="5"/>
-            <w:shd w:val="clear" w:color="auto" w:fill="FFFFFF" w:themeFill="background1"/>
-            <w:vAlign w:val="center"/>
-          </w:tcPr>
-          <w:p>
-            <w:pPr>
-              <w:ind w:left="-129"/>
-              <w:jc w:val="center"/>
-              <w:rPr>
-                <w:rFonts w:ascii="Arial" w:hAnsi="Arial" w:cs="Arial"/>
-                <w:b/>
-                <w:bCs/>
-              </w:rPr>
-            </w:pPr>
             <w:r>
               <w:rPr>
                 <w:rFonts w:ascii="Arial" w:hAnsi="Arial" w:cs="Arial"/>
@@ -794,7 +797,7 @@
         </w:tc>
         <w:tc>
           <w:tcPr>
-            <w:tcW w:w="2905" w:type="dxa"/>
+            <w:tcW w:w="2813" w:type="dxa"/>
             <w:gridSpan w:val="4"/>
             <w:shd w:val="clear" w:color="auto" w:fill="FFFFFF" w:themeFill="background1"/>
             <w:vAlign w:val="center"/>
@@ -818,7 +821,7 @@
         </w:trPr>
         <w:tc>
           <w:tcPr>
-            <w:tcW w:w="2904" w:type="dxa"/>
+            <w:tcW w:w="2620" w:type="dxa"/>
             <w:gridSpan w:val="3"/>
             <w:shd w:val="clear" w:color="auto" w:fill="FFFFFF" w:themeFill="background1"/>
             <w:vAlign w:val="center"/>
@@ -863,8 +866,27 @@
         </w:tc>
         <w:tc>
           <w:tcPr>
+            <w:tcW w:w="3281" w:type="dxa"/>
+            <w:gridSpan w:val="6"/>
+            <w:shd w:val="clear" w:color="auto" w:fill="FFFFFF" w:themeFill="background1"/>
+            <w:vAlign w:val="center"/>
+          </w:tcPr>
+          <w:p>
+            <w:pPr>
+              <w:ind w:left="-129"/>
+              <w:jc w:val="center"/>
+              <w:rPr>
+                <w:rFonts w:ascii="Arial" w:hAnsi="Arial" w:cs="Arial"/>
+                <w:b/>
+                <w:bCs/>
+              </w:rPr>
+            </w:pPr>
+          </w:p>
+        </w:tc>
+        <w:tc>
+          <w:tcPr>
             <w:tcW w:w="2905" w:type="dxa"/>
-            <w:gridSpan w:val="4"/>
+            <w:gridSpan w:val="6"/>
             <w:shd w:val="clear" w:color="auto" w:fill="FFFFFF" w:themeFill="background1"/>
             <w:vAlign w:val="center"/>
           </w:tcPr>
@@ -878,25 +900,6 @@
                 <w:bCs/>
               </w:rPr>
             </w:pPr>
-          </w:p>
-        </w:tc>
-        <w:tc>
-          <w:tcPr>
-            <w:tcW w:w="2905" w:type="dxa"/>
-            <w:gridSpan w:val="5"/>
-            <w:shd w:val="clear" w:color="auto" w:fill="FFFFFF" w:themeFill="background1"/>
-            <w:vAlign w:val="center"/>
-          </w:tcPr>
-          <w:p>
-            <w:pPr>
-              <w:ind w:left="-129"/>
-              <w:jc w:val="center"/>
-              <w:rPr>
-                <w:rFonts w:ascii="Arial" w:hAnsi="Arial" w:cs="Arial"/>
-                <w:b/>
-                <w:bCs/>
-              </w:rPr>
-            </w:pPr>
             <w:r>
               <w:rPr>
                 <w:rFonts w:ascii="Arial" w:hAnsi="Arial" w:cs="Arial"/>
@@ -909,7 +912,7 @@
         </w:tc>
         <w:tc>
           <w:tcPr>
-            <w:tcW w:w="2905" w:type="dxa"/>
+            <w:tcW w:w="2813" w:type="dxa"/>
             <w:gridSpan w:val="4"/>
             <w:shd w:val="clear" w:color="auto" w:fill="FFFFFF" w:themeFill="background1"/>
             <w:vAlign w:val="center"/>
@@ -933,7 +936,7 @@
         </w:trPr>
         <w:tc>
           <w:tcPr>
-            <w:tcW w:w="2904" w:type="dxa"/>
+            <w:tcW w:w="2620" w:type="dxa"/>
             <w:gridSpan w:val="3"/>
             <w:shd w:val="clear" w:color="auto" w:fill="FFFFFF" w:themeFill="background1"/>
             <w:vAlign w:val="center"/>
@@ -960,8 +963,27 @@
         </w:tc>
         <w:tc>
           <w:tcPr>
+            <w:tcW w:w="3281" w:type="dxa"/>
+            <w:gridSpan w:val="6"/>
+            <w:shd w:val="clear" w:color="auto" w:fill="FFFFFF" w:themeFill="background1"/>
+            <w:vAlign w:val="center"/>
+          </w:tcPr>
+          <w:p>
+            <w:pPr>
+              <w:ind w:left="-129"/>
+              <w:jc w:val="center"/>
+              <w:rPr>
+                <w:rFonts w:ascii="Arial" w:hAnsi="Arial" w:cs="Arial"/>
+                <w:b/>
+                <w:bCs/>
+              </w:rPr>
+            </w:pPr>
+          </w:p>
+        </w:tc>
+        <w:tc>
+          <w:tcPr>
             <w:tcW w:w="2905" w:type="dxa"/>
-            <w:gridSpan w:val="4"/>
+            <w:gridSpan w:val="6"/>
             <w:shd w:val="clear" w:color="auto" w:fill="FFFFFF" w:themeFill="background1"/>
             <w:vAlign w:val="center"/>
           </w:tcPr>
@@ -975,25 +997,6 @@
                 <w:bCs/>
               </w:rPr>
             </w:pPr>
-          </w:p>
-        </w:tc>
-        <w:tc>
-          <w:tcPr>
-            <w:tcW w:w="2905" w:type="dxa"/>
-            <w:gridSpan w:val="5"/>
-            <w:shd w:val="clear" w:color="auto" w:fill="FFFFFF" w:themeFill="background1"/>
-            <w:vAlign w:val="center"/>
-          </w:tcPr>
-          <w:p>
-            <w:pPr>
-              <w:ind w:left="-129"/>
-              <w:jc w:val="center"/>
-              <w:rPr>
-                <w:rFonts w:ascii="Arial" w:hAnsi="Arial" w:cs="Arial"/>
-                <w:b/>
-                <w:bCs/>
-              </w:rPr>
-            </w:pPr>
             <w:r>
               <w:rPr>
                 <w:rFonts w:ascii="Arial" w:hAnsi="Arial" w:cs="Arial"/>
@@ -1006,7 +1009,7 @@
         </w:tc>
         <w:tc>
           <w:tcPr>
-            <w:tcW w:w="2905" w:type="dxa"/>
+            <w:tcW w:w="2813" w:type="dxa"/>
             <w:gridSpan w:val="4"/>
             <w:shd w:val="clear" w:color="auto" w:fill="FFFFFF" w:themeFill="background1"/>
             <w:vAlign w:val="center"/>
@@ -1031,7 +1034,7 @@
         <w:tc>
           <w:tcPr>
             <w:tcW w:w="11619" w:type="dxa"/>
-            <w:gridSpan w:val="16"/>
+            <w:gridSpan w:val="19"/>
             <w:shd w:val="clear" w:color="auto" w:fill="D1D1D1" w:themeFill="background2" w:themeFillShade="E6"/>
             <w:vAlign w:val="center"/>
           </w:tcPr>
@@ -1062,8 +1065,8 @@
         </w:trPr>
         <w:tc>
           <w:tcPr>
-            <w:tcW w:w="5809" w:type="dxa"/>
-            <w:gridSpan w:val="7"/>
+            <w:tcW w:w="5665" w:type="dxa"/>
+            <w:gridSpan w:val="8"/>
             <w:shd w:val="clear" w:color="auto" w:fill="FFFFFF" w:themeFill="background1"/>
             <w:vAlign w:val="center"/>
           </w:tcPr>
@@ -1089,8 +1092,8 @@
         </w:tc>
         <w:tc>
           <w:tcPr>
-            <w:tcW w:w="5810" w:type="dxa"/>
-            <w:gridSpan w:val="9"/>
+            <w:tcW w:w="5954" w:type="dxa"/>
+            <w:gridSpan w:val="11"/>
             <w:shd w:val="clear" w:color="auto" w:fill="FFFFFF" w:themeFill="background1"/>
             <w:vAlign w:val="center"/>
           </w:tcPr>
@@ -1114,7 +1117,7 @@
         <w:tc>
           <w:tcPr>
             <w:tcW w:w="11619" w:type="dxa"/>
-            <w:gridSpan w:val="16"/>
+            <w:gridSpan w:val="19"/>
             <w:shd w:val="clear" w:color="auto" w:fill="FFFFFF" w:themeFill="background1"/>
             <w:vAlign w:val="center"/>
           </w:tcPr>
@@ -1146,7 +1149,7 @@
         <w:tc>
           <w:tcPr>
             <w:tcW w:w="11619" w:type="dxa"/>
-            <w:gridSpan w:val="16"/>
+            <w:gridSpan w:val="19"/>
             <w:shd w:val="clear" w:color="auto" w:fill="FFFFFF" w:themeFill="background1"/>
             <w:vAlign w:val="center"/>
           </w:tcPr>
@@ -1170,7 +1173,7 @@
         <w:tc>
           <w:tcPr>
             <w:tcW w:w="11619" w:type="dxa"/>
-            <w:gridSpan w:val="16"/>
+            <w:gridSpan w:val="19"/>
             <w:shd w:val="clear" w:color="auto" w:fill="D1D1D1" w:themeFill="background2" w:themeFillShade="E6"/>
             <w:vAlign w:val="center"/>
           </w:tcPr>
@@ -1229,7 +1232,7 @@
         <w:tc>
           <w:tcPr>
             <w:tcW w:w="1937" w:type="dxa"/>
-            <w:gridSpan w:val="3"/>
+            <w:gridSpan w:val="4"/>
             <w:shd w:val="clear" w:color="auto" w:fill="F2F2F2" w:themeFill="background1" w:themeFillShade="F2"/>
             <w:vAlign w:val="center"/>
           </w:tcPr>
@@ -1247,7 +1250,7 @@
         </w:tc>
         <w:tc>
           <w:tcPr>
-            <w:tcW w:w="1936" w:type="dxa"/>
+            <w:tcW w:w="1792" w:type="dxa"/>
             <w:gridSpan w:val="2"/>
             <w:shd w:val="clear" w:color="auto" w:fill="F2F2F2" w:themeFill="background1" w:themeFillShade="F2"/>
             <w:vAlign w:val="center"/>
@@ -1274,8 +1277,8 @@
         </w:tc>
         <w:tc>
           <w:tcPr>
-            <w:tcW w:w="1937" w:type="dxa"/>
-            <w:gridSpan w:val="3"/>
+            <w:tcW w:w="2081" w:type="dxa"/>
+            <w:gridSpan w:val="4"/>
             <w:shd w:val="clear" w:color="auto" w:fill="F2F2F2" w:themeFill="background1" w:themeFillShade="F2"/>
             <w:vAlign w:val="center"/>
           </w:tcPr>
@@ -1294,7 +1297,7 @@
         <w:tc>
           <w:tcPr>
             <w:tcW w:w="1936" w:type="dxa"/>
-            <w:gridSpan w:val="4"/>
+            <w:gridSpan w:val="5"/>
             <w:shd w:val="clear" w:color="auto" w:fill="F2F2F2" w:themeFill="background1" w:themeFillShade="F2"/>
             <w:vAlign w:val="center"/>
           </w:tcPr>
@@ -1373,7 +1376,7 @@
         <w:tc>
           <w:tcPr>
             <w:tcW w:w="9683" w:type="dxa"/>
-            <w:gridSpan w:val="14"/>
+            <w:gridSpan w:val="17"/>
             <w:shd w:val="clear" w:color="auto" w:fill="F2F2F2" w:themeFill="background1" w:themeFillShade="F2"/>
             <w:vAlign w:val="center"/>
           </w:tcPr>
@@ -1397,7 +1400,7 @@
         <w:tc>
           <w:tcPr>
             <w:tcW w:w="11619" w:type="dxa"/>
-            <w:gridSpan w:val="16"/>
+            <w:gridSpan w:val="19"/>
             <w:shd w:val="clear" w:color="auto" w:fill="D1D1D1" w:themeFill="background2" w:themeFillShade="E6"/>
             <w:vAlign w:val="center"/>
           </w:tcPr>
@@ -1419,6 +1422,101 @@
               </w:rPr>
               <w:t>4 – CONFIRMAÇÃO DA REALIZAÇÃO DO SERVIÇO</w:t>
             </w:r>
+          </w:p>
+        </w:tc>
+      </w:tr>
+      <w:tr>
+        <w:trPr>
+          <w:trHeight w:val="560"/>
+        </w:trPr>
+        <w:tc>
+          <w:tcPr>
+            <w:tcW w:w="2972" w:type="dxa"/>
+            <w:gridSpan w:val="4"/>
+            <w:vAlign w:val="center"/>
+          </w:tcPr>
+          <w:p>
+            <w:pPr>
+              <w:ind w:left="-129"/>
+              <w:jc w:val="center"/>
+              <w:rPr>
+                <w:rFonts w:ascii="Arial" w:hAnsi="Arial" w:cs="Arial"/>
+                <w:b/>
+                <w:bCs/>
+              </w:rPr>
+            </w:pPr>
+            <w:r>
+              <w:rPr>
+                <w:rFonts w:ascii="Arial" w:hAnsi="Arial" w:cs="Arial"/>
+                <w:b/>
+                <w:sz w:val="14"/>
+                <w:szCs w:val="10"/>
+              </w:rPr>
+              <w:t>Hora da chegada ao Cliente:</w:t>
+            </w:r>
+          </w:p>
+        </w:tc>
+        <w:tc>
+          <w:tcPr>
+            <w:tcW w:w="2693" w:type="dxa"/>
+            <w:gridSpan w:val="4"/>
+            <w:vAlign w:val="center"/>
+          </w:tcPr>
+          <w:p>
+            <w:pPr>
+              <w:ind w:left="-129"/>
+              <w:jc w:val="center"/>
+              <w:rPr>
+                <w:rFonts w:ascii="Arial" w:hAnsi="Arial" w:cs="Arial"/>
+                <w:b/>
+                <w:bCs/>
+              </w:rPr>
+            </w:pPr>
+          </w:p>
+        </w:tc>
+        <w:tc>
+          <w:tcPr>
+            <w:tcW w:w="2977" w:type="dxa"/>
+            <w:gridSpan w:val="6"/>
+            <w:vAlign w:val="center"/>
+          </w:tcPr>
+          <w:p>
+            <w:pPr>
+              <w:ind w:left="-129"/>
+              <w:jc w:val="center"/>
+              <w:rPr>
+                <w:rFonts w:ascii="Arial" w:hAnsi="Arial" w:cs="Arial"/>
+                <w:b/>
+                <w:bCs/>
+              </w:rPr>
+            </w:pPr>
+            <w:r>
+              <w:rPr>
+                <w:rFonts w:ascii="Arial" w:hAnsi="Arial" w:cs="Arial"/>
+                <w:b/>
+                <w:sz w:val="14"/>
+                <w:szCs w:val="10"/>
+              </w:rPr>
+              <w:t>Hora da Saída do Cliente:</w:t>
+            </w:r>
+          </w:p>
+        </w:tc>
+        <w:tc>
+          <w:tcPr>
+            <w:tcW w:w="2977" w:type="dxa"/>
+            <w:gridSpan w:val="5"/>
+            <w:vAlign w:val="center"/>
+          </w:tcPr>
+          <w:p>
+            <w:pPr>
+              <w:ind w:left="-129"/>
+              <w:jc w:val="center"/>
+              <w:rPr>
+                <w:rFonts w:ascii="Arial" w:hAnsi="Arial" w:cs="Arial"/>
+                <w:b/>
+                <w:bCs/>
+              </w:rPr>
+            </w:pPr>
           </w:p>
         </w:tc>
       </w:tr>
@@ -1428,8 +1526,8 @@
         </w:trPr>
         <w:tc>
           <w:tcPr>
-            <w:tcW w:w="5809" w:type="dxa"/>
-            <w:gridSpan w:val="7"/>
+            <w:tcW w:w="2972" w:type="dxa"/>
+            <w:gridSpan w:val="4"/>
             <w:shd w:val="clear" w:color="auto" w:fill="FFFFFF" w:themeFill="background1"/>
             <w:vAlign w:val="center"/>
           </w:tcPr>
@@ -1447,8 +1545,46 @@
         </w:tc>
         <w:tc>
           <w:tcPr>
-            <w:tcW w:w="5810" w:type="dxa"/>
-            <w:gridSpan w:val="9"/>
+            <w:tcW w:w="2693" w:type="dxa"/>
+            <w:gridSpan w:val="4"/>
+            <w:shd w:val="clear" w:color="auto" w:fill="FFFFFF" w:themeFill="background1"/>
+            <w:vAlign w:val="center"/>
+          </w:tcPr>
+          <w:p>
+            <w:pPr>
+              <w:ind w:left="-129"/>
+              <w:jc w:val="center"/>
+              <w:rPr>
+                <w:rFonts w:ascii="Arial" w:hAnsi="Arial" w:cs="Arial"/>
+                <w:b/>
+                <w:bCs/>
+              </w:rPr>
+            </w:pPr>
+          </w:p>
+        </w:tc>
+        <w:tc>
+          <w:tcPr>
+            <w:tcW w:w="2977" w:type="dxa"/>
+            <w:gridSpan w:val="6"/>
+            <w:shd w:val="clear" w:color="auto" w:fill="FFFFFF" w:themeFill="background1"/>
+            <w:vAlign w:val="center"/>
+          </w:tcPr>
+          <w:p>
+            <w:pPr>
+              <w:ind w:left="-129"/>
+              <w:jc w:val="center"/>
+              <w:rPr>
+                <w:rFonts w:ascii="Arial" w:hAnsi="Arial" w:cs="Arial"/>
+                <w:b/>
+                <w:bCs/>
+              </w:rPr>
+            </w:pPr>
+          </w:p>
+        </w:tc>
+        <w:tc>
+          <w:tcPr>
+            <w:tcW w:w="2977" w:type="dxa"/>
+            <w:gridSpan w:val="5"/>
             <w:shd w:val="clear" w:color="auto" w:fill="FFFFFF" w:themeFill="background1"/>
             <w:vAlign w:val="center"/>
           </w:tcPr>
@@ -1471,8 +1607,8 @@
         </w:trPr>
         <w:tc>
           <w:tcPr>
-            <w:tcW w:w="5809" w:type="dxa"/>
-            <w:gridSpan w:val="7"/>
+            <w:tcW w:w="2972" w:type="dxa"/>
+            <w:gridSpan w:val="4"/>
             <w:shd w:val="clear" w:color="auto" w:fill="FFFFFF" w:themeFill="background1"/>
             <w:vAlign w:val="center"/>
           </w:tcPr>
@@ -1493,35 +1629,90 @@
                 <w:bCs/>
                 <w:i/>
               </w:rPr>
+              <w:t>Cliente</w:t>
+            </w:r>
+          </w:p>
+        </w:tc>
+        <w:tc>
+          <w:tcPr>
+            <w:tcW w:w="2693" w:type="dxa"/>
+            <w:gridSpan w:val="4"/>
+            <w:shd w:val="clear" w:color="auto" w:fill="FFFFFF" w:themeFill="background1"/>
+            <w:vAlign w:val="center"/>
+          </w:tcPr>
+          <w:p>
+            <w:pPr>
+              <w:ind w:left="-129"/>
+              <w:jc w:val="center"/>
+              <w:rPr>
+                <w:rFonts w:ascii="Arial" w:hAnsi="Arial" w:cs="Arial"/>
+                <w:b/>
+                <w:bCs/>
+              </w:rPr>
+            </w:pPr>
+            <w:r>
+              <w:rPr>
+                <w:rFonts w:ascii="Arial" w:hAnsi="Arial" w:cs="Arial"/>
+                <w:b/>
+                <w:bCs/>
+              </w:rPr>
+              <w:t>Técnico</w:t>
+            </w:r>
+          </w:p>
+        </w:tc>
+        <w:tc>
+          <w:tcPr>
+            <w:tcW w:w="2977" w:type="dxa"/>
+            <w:gridSpan w:val="6"/>
+            <w:shd w:val="clear" w:color="auto" w:fill="FFFFFF" w:themeFill="background1"/>
+            <w:vAlign w:val="center"/>
+          </w:tcPr>
+          <w:p>
+            <w:pPr>
+              <w:ind w:left="-129"/>
+              <w:jc w:val="center"/>
+              <w:rPr>
+                <w:rFonts w:ascii="Arial" w:hAnsi="Arial" w:cs="Arial"/>
+                <w:b/>
+                <w:bCs/>
+              </w:rPr>
+            </w:pPr>
+            <w:r>
+              <w:rPr>
+                <w:rFonts w:ascii="Arial" w:hAnsi="Arial" w:cs="Arial"/>
+                <w:b/>
+                <w:bCs/>
+                <w:i/>
+              </w:rPr>
+              <w:t>Diretoria</w:t>
+            </w:r>
+          </w:p>
+        </w:tc>
+        <w:tc>
+          <w:tcPr>
+            <w:tcW w:w="2977" w:type="dxa"/>
+            <w:gridSpan w:val="5"/>
+            <w:shd w:val="clear" w:color="auto" w:fill="FFFFFF" w:themeFill="background1"/>
+            <w:vAlign w:val="center"/>
+          </w:tcPr>
+          <w:p>
+            <w:pPr>
+              <w:ind w:left="-129"/>
+              <w:jc w:val="center"/>
+              <w:rPr>
+                <w:rFonts w:ascii="Arial" w:hAnsi="Arial" w:cs="Arial"/>
+                <w:b/>
+                <w:bCs/>
+              </w:rPr>
+            </w:pPr>
+            <w:r>
+              <w:rPr>
+                <w:rFonts w:ascii="Arial" w:hAnsi="Arial" w:cs="Arial"/>
+                <w:b/>
+                <w:bCs/>
+                <w:i/>
+              </w:rPr>
               <w:t>Administração</w:t>
-            </w:r>
-          </w:p>
-        </w:tc>
-        <w:tc>
-          <w:tcPr>
-            <w:tcW w:w="5810" w:type="dxa"/>
-            <w:gridSpan w:val="9"/>
-            <w:shd w:val="clear" w:color="auto" w:fill="FFFFFF" w:themeFill="background1"/>
-            <w:vAlign w:val="center"/>
-          </w:tcPr>
-          <w:p>
-            <w:pPr>
-              <w:ind w:left="-129"/>
-              <w:jc w:val="center"/>
-              <w:rPr>
-                <w:rFonts w:ascii="Arial" w:hAnsi="Arial" w:cs="Arial"/>
-                <w:b/>
-                <w:bCs/>
-              </w:rPr>
-            </w:pPr>
-            <w:r>
-              <w:rPr>
-                <w:rFonts w:ascii="Arial" w:hAnsi="Arial" w:cs="Arial"/>
-                <w:b/>
-                <w:bCs/>
-                <w:i/>
-              </w:rPr>
-              <w:t>Diretoria</w:t>
             </w:r>
           </w:p>
         </w:tc>

</xml_diff>

<commit_message>
fix(qualidade): preenche a analise do tecnico no PDF do cliente da RCC.
Co-authored-by: Cursor <cursoragent@cursor.com>
</commit_message>
<xml_diff>
--- a/backend/scripts/sgq/rcc-pdf/templates/cliente.docx
+++ b/backend/scripts/sgq/rcc-pdf/templates/cliente.docx
@@ -29,12 +29,14 @@
         <w:gridCol w:w="236"/>
         <w:gridCol w:w="331"/>
         <w:gridCol w:w="426"/>
-        <w:gridCol w:w="1088"/>
+        <w:gridCol w:w="141"/>
+        <w:gridCol w:w="947"/>
         <w:gridCol w:w="46"/>
         <w:gridCol w:w="850"/>
         <w:gridCol w:w="164"/>
         <w:gridCol w:w="261"/>
-        <w:gridCol w:w="615"/>
+        <w:gridCol w:w="142"/>
+        <w:gridCol w:w="473"/>
         <w:gridCol w:w="732"/>
         <w:gridCol w:w="1205"/>
       </w:tblGrid>
@@ -45,7 +47,7 @@
         <w:tc>
           <w:tcPr>
             <w:tcW w:w="11619" w:type="dxa"/>
-            <w:gridSpan w:val="19"/>
+            <w:gridSpan w:val="21"/>
             <w:shd w:val="clear" w:color="auto" w:fill="D9D9D9"/>
             <w:vAlign w:val="center"/>
           </w:tcPr>
@@ -155,7 +157,7 @@
         <w:tc>
           <w:tcPr>
             <w:tcW w:w="1560" w:type="dxa"/>
-            <w:gridSpan w:val="3"/>
+            <w:gridSpan w:val="4"/>
             <w:vAlign w:val="center"/>
           </w:tcPr>
           <w:p>
@@ -194,7 +196,7 @@
         <w:tc>
           <w:tcPr>
             <w:tcW w:w="1347" w:type="dxa"/>
-            <w:gridSpan w:val="2"/>
+            <w:gridSpan w:val="3"/>
             <w:vAlign w:val="center"/>
           </w:tcPr>
           <w:p>
@@ -244,7 +246,7 @@
         <w:tc>
           <w:tcPr>
             <w:tcW w:w="11619" w:type="dxa"/>
-            <w:gridSpan w:val="19"/>
+            <w:gridSpan w:val="21"/>
             <w:shd w:val="clear" w:color="auto" w:fill="D1D1D1" w:themeFill="background2" w:themeFillShade="E6"/>
             <w:vAlign w:val="center"/>
           </w:tcPr>
@@ -325,7 +327,7 @@
         <w:tc>
           <w:tcPr>
             <w:tcW w:w="2409" w:type="dxa"/>
-            <w:gridSpan w:val="5"/>
+            <w:gridSpan w:val="6"/>
             <w:vAlign w:val="center"/>
           </w:tcPr>
           <w:p>
@@ -349,7 +351,7 @@
         <w:tc>
           <w:tcPr>
             <w:tcW w:w="2552" w:type="dxa"/>
-            <w:gridSpan w:val="3"/>
+            <w:gridSpan w:val="4"/>
             <w:vAlign w:val="center"/>
           </w:tcPr>
           <w:p>
@@ -427,7 +429,7 @@
         <w:tc>
           <w:tcPr>
             <w:tcW w:w="1134" w:type="dxa"/>
-            <w:gridSpan w:val="2"/>
+            <w:gridSpan w:val="3"/>
             <w:tcBorders>
               <w:bottom w:val="single" w:sz="4" w:space="0" w:color="auto"/>
             </w:tcBorders>
@@ -461,7 +463,7 @@
         <w:tc>
           <w:tcPr>
             <w:tcW w:w="3827" w:type="dxa"/>
-            <w:gridSpan w:val="6"/>
+            <w:gridSpan w:val="7"/>
             <w:tcBorders>
               <w:bottom w:val="single" w:sz="4" w:space="0" w:color="auto"/>
             </w:tcBorders>
@@ -545,7 +547,7 @@
         <w:tc>
           <w:tcPr>
             <w:tcW w:w="1134" w:type="dxa"/>
-            <w:gridSpan w:val="2"/>
+            <w:gridSpan w:val="3"/>
             <w:tcBorders>
               <w:bottom w:val="single" w:sz="4" w:space="0" w:color="auto"/>
             </w:tcBorders>
@@ -572,7 +574,7 @@
         <w:tc>
           <w:tcPr>
             <w:tcW w:w="3827" w:type="dxa"/>
-            <w:gridSpan w:val="6"/>
+            <w:gridSpan w:val="7"/>
             <w:tcBorders>
               <w:bottom w:val="single" w:sz="4" w:space="0" w:color="auto"/>
             </w:tcBorders>
@@ -639,7 +641,7 @@
         <w:tc>
           <w:tcPr>
             <w:tcW w:w="1134" w:type="dxa"/>
-            <w:gridSpan w:val="2"/>
+            <w:gridSpan w:val="3"/>
             <w:tcBorders>
               <w:bottom w:val="single" w:sz="4" w:space="0" w:color="auto"/>
             </w:tcBorders>
@@ -666,7 +668,7 @@
         <w:tc>
           <w:tcPr>
             <w:tcW w:w="3827" w:type="dxa"/>
-            <w:gridSpan w:val="6"/>
+            <w:gridSpan w:val="7"/>
             <w:tcBorders>
               <w:bottom w:val="single" w:sz="4" w:space="0" w:color="auto"/>
             </w:tcBorders>
@@ -690,7 +692,7 @@
         <w:tc>
           <w:tcPr>
             <w:tcW w:w="11619" w:type="dxa"/>
-            <w:gridSpan w:val="19"/>
+            <w:gridSpan w:val="21"/>
             <w:tcBorders>
               <w:bottom w:val="single" w:sz="4" w:space="0" w:color="auto"/>
             </w:tcBorders>
@@ -771,7 +773,7 @@
         <w:tc>
           <w:tcPr>
             <w:tcW w:w="2905" w:type="dxa"/>
-            <w:gridSpan w:val="6"/>
+            <w:gridSpan w:val="7"/>
             <w:shd w:val="clear" w:color="auto" w:fill="FFFFFF" w:themeFill="background1"/>
             <w:vAlign w:val="center"/>
           </w:tcPr>
@@ -798,7 +800,7 @@
         <w:tc>
           <w:tcPr>
             <w:tcW w:w="2813" w:type="dxa"/>
-            <w:gridSpan w:val="4"/>
+            <w:gridSpan w:val="5"/>
             <w:shd w:val="clear" w:color="auto" w:fill="FFFFFF" w:themeFill="background1"/>
             <w:vAlign w:val="center"/>
           </w:tcPr>
@@ -886,7 +888,7 @@
         <w:tc>
           <w:tcPr>
             <w:tcW w:w="2905" w:type="dxa"/>
-            <w:gridSpan w:val="6"/>
+            <w:gridSpan w:val="7"/>
             <w:shd w:val="clear" w:color="auto" w:fill="FFFFFF" w:themeFill="background1"/>
             <w:vAlign w:val="center"/>
           </w:tcPr>
@@ -913,7 +915,7 @@
         <w:tc>
           <w:tcPr>
             <w:tcW w:w="2813" w:type="dxa"/>
-            <w:gridSpan w:val="4"/>
+            <w:gridSpan w:val="5"/>
             <w:shd w:val="clear" w:color="auto" w:fill="FFFFFF" w:themeFill="background1"/>
             <w:vAlign w:val="center"/>
           </w:tcPr>
@@ -983,7 +985,7 @@
         <w:tc>
           <w:tcPr>
             <w:tcW w:w="2905" w:type="dxa"/>
-            <w:gridSpan w:val="6"/>
+            <w:gridSpan w:val="7"/>
             <w:shd w:val="clear" w:color="auto" w:fill="FFFFFF" w:themeFill="background1"/>
             <w:vAlign w:val="center"/>
           </w:tcPr>
@@ -1010,7 +1012,7 @@
         <w:tc>
           <w:tcPr>
             <w:tcW w:w="2813" w:type="dxa"/>
-            <w:gridSpan w:val="4"/>
+            <w:gridSpan w:val="5"/>
             <w:shd w:val="clear" w:color="auto" w:fill="FFFFFF" w:themeFill="background1"/>
             <w:vAlign w:val="center"/>
           </w:tcPr>
@@ -1034,7 +1036,7 @@
         <w:tc>
           <w:tcPr>
             <w:tcW w:w="11619" w:type="dxa"/>
-            <w:gridSpan w:val="19"/>
+            <w:gridSpan w:val="21"/>
             <w:shd w:val="clear" w:color="auto" w:fill="D1D1D1" w:themeFill="background2" w:themeFillShade="E6"/>
             <w:vAlign w:val="center"/>
           </w:tcPr>
@@ -1093,7 +1095,7 @@
         <w:tc>
           <w:tcPr>
             <w:tcW w:w="5954" w:type="dxa"/>
-            <w:gridSpan w:val="11"/>
+            <w:gridSpan w:val="13"/>
             <w:shd w:val="clear" w:color="auto" w:fill="FFFFFF" w:themeFill="background1"/>
             <w:vAlign w:val="center"/>
           </w:tcPr>
@@ -1117,7 +1119,7 @@
         <w:tc>
           <w:tcPr>
             <w:tcW w:w="11619" w:type="dxa"/>
-            <w:gridSpan w:val="19"/>
+            <w:gridSpan w:val="21"/>
             <w:shd w:val="clear" w:color="auto" w:fill="FFFFFF" w:themeFill="background1"/>
             <w:vAlign w:val="center"/>
           </w:tcPr>
@@ -1149,7 +1151,7 @@
         <w:tc>
           <w:tcPr>
             <w:tcW w:w="11619" w:type="dxa"/>
-            <w:gridSpan w:val="19"/>
+            <w:gridSpan w:val="21"/>
             <w:shd w:val="clear" w:color="auto" w:fill="FFFFFF" w:themeFill="background1"/>
             <w:vAlign w:val="center"/>
           </w:tcPr>
@@ -1173,7 +1175,7 @@
         <w:tc>
           <w:tcPr>
             <w:tcW w:w="11619" w:type="dxa"/>
-            <w:gridSpan w:val="19"/>
+            <w:gridSpan w:val="21"/>
             <w:shd w:val="clear" w:color="auto" w:fill="D1D1D1" w:themeFill="background2" w:themeFillShade="E6"/>
             <w:vAlign w:val="center"/>
           </w:tcPr>
@@ -1278,7 +1280,7 @@
         <w:tc>
           <w:tcPr>
             <w:tcW w:w="2081" w:type="dxa"/>
-            <w:gridSpan w:val="4"/>
+            <w:gridSpan w:val="5"/>
             <w:shd w:val="clear" w:color="auto" w:fill="F2F2F2" w:themeFill="background1" w:themeFillShade="F2"/>
             <w:vAlign w:val="center"/>
           </w:tcPr>
@@ -1297,7 +1299,7 @@
         <w:tc>
           <w:tcPr>
             <w:tcW w:w="1936" w:type="dxa"/>
-            <w:gridSpan w:val="5"/>
+            <w:gridSpan w:val="6"/>
             <w:shd w:val="clear" w:color="auto" w:fill="F2F2F2" w:themeFill="background1" w:themeFillShade="F2"/>
             <w:vAlign w:val="center"/>
           </w:tcPr>
@@ -1376,7 +1378,191 @@
         <w:tc>
           <w:tcPr>
             <w:tcW w:w="9683" w:type="dxa"/>
-            <w:gridSpan w:val="17"/>
+            <w:gridSpan w:val="19"/>
+            <w:shd w:val="clear" w:color="auto" w:fill="F2F2F2" w:themeFill="background1" w:themeFillShade="F2"/>
+            <w:vAlign w:val="center"/>
+          </w:tcPr>
+          <w:p>
+            <w:pPr>
+              <w:ind w:left="-129"/>
+              <w:jc w:val="center"/>
+              <w:rPr>
+                <w:rFonts w:ascii="Arial" w:hAnsi="Arial" w:cs="Arial"/>
+                <w:b/>
+                <w:bCs/>
+              </w:rPr>
+            </w:pPr>
+          </w:p>
+        </w:tc>
+      </w:tr>
+      <w:tr>
+        <w:trPr>
+          <w:trHeight w:val="324"/>
+        </w:trPr>
+        <w:tc>
+          <w:tcPr>
+            <w:tcW w:w="11619" w:type="dxa"/>
+            <w:gridSpan w:val="21"/>
+            <w:shd w:val="clear" w:color="auto" w:fill="D1D1D1" w:themeFill="background2" w:themeFillShade="E6"/>
+            <w:vAlign w:val="center"/>
+          </w:tcPr>
+          <w:p>
+            <w:pPr>
+              <w:ind w:left="-129"/>
+              <w:jc w:val="center"/>
+              <w:rPr>
+                <w:rFonts w:ascii="Arial" w:hAnsi="Arial" w:cs="Arial"/>
+                <w:b/>
+                <w:bCs/>
+              </w:rPr>
+            </w:pPr>
+            <w:r>
+              <w:rPr>
+                <w:rFonts w:ascii="Arial" w:hAnsi="Arial" w:cs="Arial"/>
+                <w:b/>
+              </w:rPr>
+              <w:t>3 – ANÁLISE DO TÉCNICO</w:t>
+            </w:r>
+          </w:p>
+        </w:tc>
+      </w:tr>
+      <w:tr>
+        <w:trPr>
+          <w:trHeight w:val="428"/>
+        </w:trPr>
+        <w:tc>
+          <w:tcPr>
+            <w:tcW w:w="1936" w:type="dxa"/>
+            <w:gridSpan w:val="2"/>
+            <w:shd w:val="clear" w:color="auto" w:fill="F2F2F2" w:themeFill="background1" w:themeFillShade="F2"/>
+            <w:vAlign w:val="center"/>
+          </w:tcPr>
+          <w:p>
+            <w:pPr>
+              <w:ind w:left="-129"/>
+              <w:jc w:val="center"/>
+              <w:rPr>
+                <w:rFonts w:ascii="Arial" w:hAnsi="Arial" w:cs="Arial"/>
+                <w:b/>
+                <w:bCs/>
+                <w:i/>
+              </w:rPr>
+            </w:pPr>
+            <w:r>
+              <w:rPr>
+                <w:rFonts w:ascii="Arial" w:hAnsi="Arial" w:cs="Arial"/>
+                <w:b/>
+                <w:sz w:val="14"/>
+                <w:szCs w:val="10"/>
+              </w:rPr>
+              <w:t>Serviço Realizado</w:t>
+            </w:r>
+          </w:p>
+        </w:tc>
+        <w:tc>
+          <w:tcPr>
+            <w:tcW w:w="9683" w:type="dxa"/>
+            <w:gridSpan w:val="19"/>
+            <w:shd w:val="clear" w:color="auto" w:fill="F2F2F2" w:themeFill="background1" w:themeFillShade="F2"/>
+            <w:vAlign w:val="center"/>
+          </w:tcPr>
+          <w:p>
+            <w:pPr>
+              <w:ind w:left="-129"/>
+              <w:jc w:val="center"/>
+              <w:rPr>
+                <w:rFonts w:ascii="Arial" w:hAnsi="Arial" w:cs="Arial"/>
+                <w:b/>
+                <w:bCs/>
+              </w:rPr>
+            </w:pPr>
+          </w:p>
+        </w:tc>
+      </w:tr>
+      <w:tr>
+        <w:trPr>
+          <w:trHeight w:val="548"/>
+        </w:trPr>
+        <w:tc>
+          <w:tcPr>
+            <w:tcW w:w="1936" w:type="dxa"/>
+            <w:gridSpan w:val="2"/>
+            <w:shd w:val="clear" w:color="auto" w:fill="F2F2F2" w:themeFill="background1" w:themeFillShade="F2"/>
+            <w:vAlign w:val="center"/>
+          </w:tcPr>
+          <w:p>
+            <w:pPr>
+              <w:ind w:left="-129"/>
+              <w:jc w:val="center"/>
+              <w:rPr>
+                <w:rFonts w:ascii="Arial" w:hAnsi="Arial" w:cs="Arial"/>
+                <w:b/>
+                <w:bCs/>
+                <w:i/>
+              </w:rPr>
+            </w:pPr>
+            <w:r>
+              <w:rPr>
+                <w:rFonts w:ascii="Arial" w:hAnsi="Arial" w:cs="Arial"/>
+                <w:b/>
+                <w:sz w:val="14"/>
+                <w:szCs w:val="10"/>
+              </w:rPr>
+              <w:t>Problema solucionado?</w:t>
+            </w:r>
+          </w:p>
+        </w:tc>
+        <w:tc>
+          <w:tcPr>
+            <w:tcW w:w="4863" w:type="dxa"/>
+            <w:gridSpan w:val="10"/>
+            <w:shd w:val="clear" w:color="auto" w:fill="F2F2F2" w:themeFill="background1" w:themeFillShade="F2"/>
+            <w:vAlign w:val="center"/>
+          </w:tcPr>
+          <w:p>
+            <w:pPr>
+              <w:ind w:left="-129"/>
+              <w:jc w:val="center"/>
+              <w:rPr>
+                <w:rFonts w:ascii="Arial" w:hAnsi="Arial" w:cs="Arial"/>
+                <w:b/>
+                <w:bCs/>
+              </w:rPr>
+            </w:pPr>
+          </w:p>
+        </w:tc>
+        <w:tc>
+          <w:tcPr>
+            <w:tcW w:w="2410" w:type="dxa"/>
+            <w:gridSpan w:val="6"/>
+            <w:shd w:val="clear" w:color="auto" w:fill="F2F2F2" w:themeFill="background1" w:themeFillShade="F2"/>
+            <w:vAlign w:val="center"/>
+          </w:tcPr>
+          <w:p>
+            <w:pPr>
+              <w:ind w:left="-129"/>
+              <w:jc w:val="center"/>
+              <w:rPr>
+                <w:rFonts w:ascii="Arial" w:hAnsi="Arial" w:cs="Arial"/>
+                <w:b/>
+                <w:bCs/>
+              </w:rPr>
+            </w:pPr>
+            <w:r>
+              <w:rPr>
+                <w:rFonts w:ascii="Arial" w:hAnsi="Arial" w:cs="Arial"/>
+                <w:b/>
+                <w:sz w:val="14"/>
+                <w:szCs w:val="10"/>
+              </w:rPr>
+              <w:t>Data de conclusão:</w:t>
+            </w:r>
+          </w:p>
+        </w:tc>
+        <w:tc>
+          <w:tcPr>
+            <w:tcW w:w="2410" w:type="dxa"/>
+            <w:gridSpan w:val="3"/>
             <w:shd w:val="clear" w:color="auto" w:fill="F2F2F2" w:themeFill="background1" w:themeFillShade="F2"/>
             <w:vAlign w:val="center"/>
           </w:tcPr>
@@ -1400,7 +1586,7 @@
         <w:tc>
           <w:tcPr>
             <w:tcW w:w="11619" w:type="dxa"/>
-            <w:gridSpan w:val="19"/>
+            <w:gridSpan w:val="21"/>
             <w:shd w:val="clear" w:color="auto" w:fill="D1D1D1" w:themeFill="background2" w:themeFillShade="E6"/>
             <w:vAlign w:val="center"/>
           </w:tcPr>
@@ -1477,7 +1663,7 @@
         <w:tc>
           <w:tcPr>
             <w:tcW w:w="2977" w:type="dxa"/>
-            <w:gridSpan w:val="6"/>
+            <w:gridSpan w:val="7"/>
             <w:vAlign w:val="center"/>
           </w:tcPr>
           <w:p>
@@ -1504,7 +1690,7 @@
         <w:tc>
           <w:tcPr>
             <w:tcW w:w="2977" w:type="dxa"/>
-            <w:gridSpan w:val="5"/>
+            <w:gridSpan w:val="6"/>
             <w:vAlign w:val="center"/>
           </w:tcPr>
           <w:p>
@@ -1565,26 +1751,26 @@
         <w:tc>
           <w:tcPr>
             <w:tcW w:w="2977" w:type="dxa"/>
+            <w:gridSpan w:val="7"/>
+            <w:shd w:val="clear" w:color="auto" w:fill="FFFFFF" w:themeFill="background1"/>
+            <w:vAlign w:val="center"/>
+          </w:tcPr>
+          <w:p>
+            <w:pPr>
+              <w:ind w:left="-129"/>
+              <w:jc w:val="center"/>
+              <w:rPr>
+                <w:rFonts w:ascii="Arial" w:hAnsi="Arial" w:cs="Arial"/>
+                <w:b/>
+                <w:bCs/>
+              </w:rPr>
+            </w:pPr>
+          </w:p>
+        </w:tc>
+        <w:tc>
+          <w:tcPr>
+            <w:tcW w:w="2977" w:type="dxa"/>
             <w:gridSpan w:val="6"/>
-            <w:shd w:val="clear" w:color="auto" w:fill="FFFFFF" w:themeFill="background1"/>
-            <w:vAlign w:val="center"/>
-          </w:tcPr>
-          <w:p>
-            <w:pPr>
-              <w:ind w:left="-129"/>
-              <w:jc w:val="center"/>
-              <w:rPr>
-                <w:rFonts w:ascii="Arial" w:hAnsi="Arial" w:cs="Arial"/>
-                <w:b/>
-                <w:bCs/>
-              </w:rPr>
-            </w:pPr>
-          </w:p>
-        </w:tc>
-        <w:tc>
-          <w:tcPr>
-            <w:tcW w:w="2977" w:type="dxa"/>
-            <w:gridSpan w:val="5"/>
             <w:shd w:val="clear" w:color="auto" w:fill="FFFFFF" w:themeFill="background1"/>
             <w:vAlign w:val="center"/>
           </w:tcPr>
@@ -1663,35 +1849,35 @@
         <w:tc>
           <w:tcPr>
             <w:tcW w:w="2977" w:type="dxa"/>
+            <w:gridSpan w:val="7"/>
+            <w:shd w:val="clear" w:color="auto" w:fill="FFFFFF" w:themeFill="background1"/>
+            <w:vAlign w:val="center"/>
+          </w:tcPr>
+          <w:p>
+            <w:pPr>
+              <w:ind w:left="-129"/>
+              <w:jc w:val="center"/>
+              <w:rPr>
+                <w:rFonts w:ascii="Arial" w:hAnsi="Arial" w:cs="Arial"/>
+                <w:b/>
+                <w:bCs/>
+              </w:rPr>
+            </w:pPr>
+            <w:r>
+              <w:rPr>
+                <w:rFonts w:ascii="Arial" w:hAnsi="Arial" w:cs="Arial"/>
+                <w:b/>
+                <w:bCs/>
+                <w:i/>
+              </w:rPr>
+              <w:t>Diretoria</w:t>
+            </w:r>
+          </w:p>
+        </w:tc>
+        <w:tc>
+          <w:tcPr>
+            <w:tcW w:w="2977" w:type="dxa"/>
             <w:gridSpan w:val="6"/>
-            <w:shd w:val="clear" w:color="auto" w:fill="FFFFFF" w:themeFill="background1"/>
-            <w:vAlign w:val="center"/>
-          </w:tcPr>
-          <w:p>
-            <w:pPr>
-              <w:ind w:left="-129"/>
-              <w:jc w:val="center"/>
-              <w:rPr>
-                <w:rFonts w:ascii="Arial" w:hAnsi="Arial" w:cs="Arial"/>
-                <w:b/>
-                <w:bCs/>
-              </w:rPr>
-            </w:pPr>
-            <w:r>
-              <w:rPr>
-                <w:rFonts w:ascii="Arial" w:hAnsi="Arial" w:cs="Arial"/>
-                <w:b/>
-                <w:bCs/>
-                <w:i/>
-              </w:rPr>
-              <w:t>Diretoria</w:t>
-            </w:r>
-          </w:p>
-        </w:tc>
-        <w:tc>
-          <w:tcPr>
-            <w:tcW w:w="2977" w:type="dxa"/>
-            <w:gridSpan w:val="5"/>
             <w:shd w:val="clear" w:color="auto" w:fill="FFFFFF" w:themeFill="background1"/>
             <w:vAlign w:val="center"/>
           </w:tcPr>

</xml_diff>